<commit_message>
add: ELT 539 - Atividade: Scratch
</commit_message>
<xml_diff>
--- a/5-Topicos-Especiais-em-Robotica/Atividades-Avaliativas/Scratch/Atividade-Scratch.docx
+++ b/5-Topicos-Especiais-em-Robotica/Atividades-Avaliativas/Scratch/Atividade-Scratch.docx
@@ -90,12 +90,12 @@
             <w:pPr>
               <w:spacing w:line="360" w:lineRule="auto"/>
               <w:rPr>
-                <w:rFonts w:ascii="Didot" w:hAnsi="Didot" w:cs="Didot"/>
+                <w:rFonts w:ascii="Didot" w:hAnsi="Didot" w:cs="Didot" w:hint="cs"/>
               </w:rPr>
             </w:pPr>
             <w:r>
               <w:rPr>
-                <w:rFonts w:ascii="Didot" w:hAnsi="Didot" w:cs="Didot"/>
+                <w:rFonts w:ascii="Didot" w:hAnsi="Didot" w:cs="Didot" w:hint="cs"/>
               </w:rPr>
               <w:t>Universidade Federal de Viçosa</w:t>
             </w:r>
@@ -104,12 +104,12 @@
             <w:pPr>
               <w:spacing w:line="360" w:lineRule="auto"/>
               <w:rPr>
-                <w:rFonts w:ascii="Didot" w:hAnsi="Didot" w:cs="Didot"/>
+                <w:rFonts w:ascii="Didot" w:hAnsi="Didot" w:cs="Didot" w:hint="cs"/>
               </w:rPr>
             </w:pPr>
             <w:r>
               <w:rPr>
-                <w:rFonts w:ascii="Didot" w:hAnsi="Didot" w:cs="Didot"/>
+                <w:rFonts w:ascii="Didot" w:hAnsi="Didot" w:cs="Didot" w:hint="cs"/>
               </w:rPr>
               <w:t>Disciplina: ELT 539 - Tópicos Especiais em Robótica</w:t>
             </w:r>
@@ -123,9 +123,15 @@
             </w:pPr>
             <w:r>
               <w:rPr>
+                <w:rFonts w:ascii="Didot" w:hAnsi="Didot" w:cs="Didot" w:hint="cs"/>
+              </w:rPr>
+              <w:t>Discente: Cintia I. Shinoda</w:t>
+            </w:r>
+            <w:r>
+              <w:rPr>
                 <w:rFonts w:ascii="Didot" w:hAnsi="Didot" w:cs="Didot"/>
               </w:rPr>
-              <w:t>Discente: Cintia I. Shinoda</w:t>
+              <w:t xml:space="preserve">                        Maio / 2026</w:t>
             </w:r>
           </w:p>
         </w:tc>
@@ -135,7 +141,7 @@
       <w:pPr>
         <w:spacing w:line="360" w:lineRule="auto"/>
         <w:rPr>
-          <w:rFonts w:ascii="Didot" w:hAnsi="Didot" w:cs="Didot"/>
+          <w:rFonts w:ascii="Didot" w:hAnsi="Didot" w:cs="Didot" w:hint="cs"/>
         </w:rPr>
       </w:pPr>
     </w:p>
@@ -144,27 +150,867 @@
         <w:spacing w:line="360" w:lineRule="auto"/>
         <w:jc w:val="center"/>
         <w:rPr>
-          <w:rFonts w:ascii="Didot" w:hAnsi="Didot" w:cs="Didot"/>
-        </w:rPr>
-      </w:pPr>
-      <w:r>
-        <w:rPr>
-          <w:rFonts w:ascii="Didot" w:hAnsi="Didot" w:cs="Didot"/>
+          <w:rFonts w:ascii="Didot" w:hAnsi="Didot" w:cs="Didot" w:hint="cs"/>
+        </w:rPr>
+      </w:pPr>
+      <w:r>
+        <w:rPr>
+          <w:rFonts w:ascii="Didot" w:hAnsi="Didot" w:cs="Didot" w:hint="cs"/>
         </w:rPr>
         <w:t>Scratch</w:t>
       </w:r>
     </w:p>
     <w:p>
       <w:pPr>
-        <w:spacing w:line="360" w:lineRule="auto"/>
-        <w:rPr>
-          <w:rFonts w:ascii="Didot" w:hAnsi="Didot" w:cs="Didot"/>
-        </w:rPr>
-      </w:pPr>
-    </w:p>
-    <w:p>
-      <w:pPr>
-        <w:spacing w:line="360" w:lineRule="auto"/>
+        <w:spacing w:after="0" w:line="360" w:lineRule="auto"/>
+        <w:rPr>
+          <w:rFonts w:ascii="Didot" w:hAnsi="Didot" w:cs="Didot" w:hint="cs"/>
+          <w:sz w:val="22"/>
+          <w:szCs w:val="22"/>
+        </w:rPr>
+      </w:pPr>
+    </w:p>
+    <w:p>
+      <w:pPr>
+        <w:pStyle w:val="NormalWeb"/>
+        <w:spacing w:before="0" w:beforeAutospacing="0" w:after="0" w:afterAutospacing="0" w:line="360" w:lineRule="auto"/>
+        <w:rPr>
+          <w:rFonts w:ascii="Didot" w:hAnsi="Didot" w:cs="Didot"/>
+          <w:sz w:val="22"/>
+          <w:szCs w:val="22"/>
+        </w:rPr>
+      </w:pPr>
+      <w:r>
+        <w:rPr>
+          <w:rFonts w:ascii="Didot" w:hAnsi="Didot" w:cs="Didot" w:hint="cs"/>
+          <w:sz w:val="22"/>
+          <w:szCs w:val="22"/>
+        </w:rPr>
+        <w:t>Crie um programa no Scratch para controlar um robô (sprite) que desenhe uma figura geométrica regular de n lados.</w:t>
+      </w:r>
+    </w:p>
+    <w:p>
+      <w:pPr>
+        <w:pStyle w:val="NormalWeb"/>
+        <w:spacing w:before="0" w:beforeAutospacing="0" w:after="0" w:afterAutospacing="0" w:line="360" w:lineRule="auto"/>
+        <w:rPr>
+          <w:rFonts w:ascii="Didot" w:hAnsi="Didot" w:cs="Didot" w:hint="cs"/>
+          <w:sz w:val="22"/>
+          <w:szCs w:val="22"/>
+        </w:rPr>
+      </w:pPr>
+    </w:p>
+    <w:p>
+      <w:pPr>
+        <w:pStyle w:val="NormalWeb"/>
+        <w:spacing w:before="0" w:beforeAutospacing="0" w:after="0" w:afterAutospacing="0" w:line="360" w:lineRule="auto"/>
+        <w:rPr>
+          <w:rFonts w:ascii="Didot" w:hAnsi="Didot" w:cs="Didot" w:hint="cs"/>
+          <w:b/>
+          <w:bCs/>
+          <w:sz w:val="22"/>
+          <w:szCs w:val="22"/>
+        </w:rPr>
+      </w:pPr>
+      <w:r>
+        <w:rPr>
+          <w:rFonts w:ascii="Didot" w:hAnsi="Didot" w:cs="Didot" w:hint="cs"/>
+          <w:b/>
+          <w:bCs/>
+          <w:sz w:val="22"/>
+          <w:szCs w:val="22"/>
+        </w:rPr>
+        <w:t>Entrada:</w:t>
+      </w:r>
+    </w:p>
+    <w:p>
+      <w:pPr>
+        <w:pStyle w:val="NormalWeb"/>
+        <w:spacing w:before="0" w:beforeAutospacing="0" w:after="0" w:afterAutospacing="0" w:line="360" w:lineRule="auto"/>
+        <w:rPr>
+          <w:rFonts w:ascii="Didot" w:hAnsi="Didot" w:cs="Didot" w:hint="cs"/>
+          <w:sz w:val="22"/>
+          <w:szCs w:val="22"/>
+        </w:rPr>
+      </w:pPr>
+      <w:r>
+        <w:rPr>
+          <w:rFonts w:ascii="Didot" w:hAnsi="Didot" w:cs="Didot" w:hint="cs"/>
+          <w:sz w:val="22"/>
+          <w:szCs w:val="22"/>
+        </w:rPr>
+        <w:t>Número de lados (n ≥ 3)</w:t>
+      </w:r>
+      <w:r>
+        <w:rPr>
+          <w:rFonts w:ascii="Didot" w:hAnsi="Didot" w:cs="Didot" w:hint="cs"/>
+          <w:sz w:val="22"/>
+          <w:szCs w:val="22"/>
+        </w:rPr>
+        <w:br/>
+        <w:t>Tamanho do lado</w:t>
+      </w:r>
+      <w:r>
+        <w:rPr>
+          <w:rFonts w:ascii="Didot" w:hAnsi="Didot" w:cs="Didot"/>
+          <w:sz w:val="22"/>
+          <w:szCs w:val="22"/>
+        </w:rPr>
+        <w:br/>
+      </w:r>
+    </w:p>
+    <w:p>
+      <w:pPr>
+        <w:pStyle w:val="NormalWeb"/>
+        <w:spacing w:before="0" w:beforeAutospacing="0" w:after="0" w:afterAutospacing="0" w:line="360" w:lineRule="auto"/>
+        <w:rPr>
+          <w:rFonts w:ascii="Didot" w:hAnsi="Didot" w:cs="Didot"/>
+          <w:sz w:val="22"/>
+          <w:szCs w:val="22"/>
+        </w:rPr>
+      </w:pPr>
+      <w:r>
+        <w:rPr>
+          <w:rFonts w:ascii="Didot" w:hAnsi="Didot" w:cs="Didot" w:hint="cs"/>
+          <w:b/>
+          <w:bCs/>
+          <w:sz w:val="22"/>
+          <w:szCs w:val="22"/>
+        </w:rPr>
+        <w:t>Ideia principal:</w:t>
+      </w:r>
+      <w:r>
+        <w:rPr>
+          <w:rFonts w:ascii="Didot" w:hAnsi="Didot" w:cs="Didot" w:hint="cs"/>
+          <w:b/>
+          <w:bCs/>
+          <w:sz w:val="22"/>
+          <w:szCs w:val="22"/>
+        </w:rPr>
+        <w:br/>
+      </w:r>
+      <w:r>
+        <w:rPr>
+          <w:rFonts w:ascii="Didot" w:hAnsi="Didot" w:cs="Didot" w:hint="cs"/>
+          <w:sz w:val="22"/>
+          <w:szCs w:val="22"/>
+        </w:rPr>
+        <w:t>Para desenhar o polígono, use o ângulo:</w:t>
+      </w:r>
+      <w:r>
+        <w:rPr>
+          <w:rFonts w:ascii="Didot" w:hAnsi="Didot" w:cs="Didot"/>
+          <w:sz w:val="22"/>
+          <w:szCs w:val="22"/>
+        </w:rPr>
+        <w:t xml:space="preserve"> </w:t>
+      </w:r>
+      <m:oMath>
+        <m:r>
+          <m:rPr>
+            <m:sty m:val="p"/>
+          </m:rPr>
+          <w:rPr>
+            <w:rFonts w:ascii="Cambria Math" w:hAnsi="Cambria Math" w:cs="Didot"/>
+            <w:sz w:val="22"/>
+            <w:szCs w:val="22"/>
+          </w:rPr>
+          <m:t>θ</m:t>
+        </m:r>
+        <m:r>
+          <w:rPr>
+            <w:rFonts w:ascii="Cambria Math" w:hAnsi="Cambria Math" w:cs="Didot"/>
+            <w:sz w:val="22"/>
+            <w:szCs w:val="22"/>
+          </w:rPr>
+          <m:t>=</m:t>
+        </m:r>
+        <m:f>
+          <m:fPr>
+            <m:ctrlPr>
+              <w:rPr>
+                <w:rFonts w:ascii="Cambria Math" w:hAnsi="Cambria Math" w:cs="Didot"/>
+                <w:sz w:val="22"/>
+                <w:szCs w:val="22"/>
+              </w:rPr>
+            </m:ctrlPr>
+          </m:fPr>
+          <m:num>
+            <m:r>
+              <w:rPr>
+                <w:rFonts w:ascii="Cambria Math" w:hAnsi="Cambria Math" w:cs="Didot"/>
+                <w:sz w:val="22"/>
+                <w:szCs w:val="22"/>
+              </w:rPr>
+              <m:t>360</m:t>
+            </m:r>
+            <m:ctrlPr>
+              <w:rPr>
+                <w:rFonts w:ascii="Cambria Math" w:hAnsi="Cambria Math" w:cs="Didot"/>
+                <w:i/>
+                <w:sz w:val="22"/>
+                <w:szCs w:val="22"/>
+              </w:rPr>
+            </m:ctrlPr>
+          </m:num>
+          <m:den>
+            <m:r>
+              <w:rPr>
+                <w:rFonts w:ascii="Cambria Math" w:hAnsi="Cambria Math" w:cs="Didot"/>
+                <w:sz w:val="22"/>
+                <w:szCs w:val="22"/>
+              </w:rPr>
+              <m:t>n</m:t>
+            </m:r>
+            <m:ctrlPr>
+              <w:rPr>
+                <w:rFonts w:ascii="Cambria Math" w:hAnsi="Cambria Math" w:cs="Didot"/>
+                <w:i/>
+                <w:sz w:val="22"/>
+                <w:szCs w:val="22"/>
+              </w:rPr>
+            </m:ctrlPr>
+          </m:den>
+        </m:f>
+      </m:oMath>
+    </w:p>
+    <w:p>
+      <w:pPr>
+        <w:pStyle w:val="NormalWeb"/>
+        <w:spacing w:before="0" w:beforeAutospacing="0" w:after="0" w:afterAutospacing="0" w:line="360" w:lineRule="auto"/>
+        <w:rPr>
+          <w:rFonts w:ascii="Didot" w:hAnsi="Didot" w:cs="Didot" w:hint="cs"/>
+          <w:sz w:val="22"/>
+          <w:szCs w:val="22"/>
+        </w:rPr>
+      </w:pPr>
+    </w:p>
+    <w:p>
+      <w:pPr>
+        <w:pStyle w:val="NormalWeb"/>
+        <w:spacing w:before="0" w:beforeAutospacing="0" w:after="0" w:afterAutospacing="0" w:line="360" w:lineRule="auto"/>
+        <w:rPr>
+          <w:rFonts w:ascii="Didot" w:hAnsi="Didot" w:cs="Didot" w:hint="cs"/>
+          <w:sz w:val="22"/>
+          <w:szCs w:val="22"/>
+        </w:rPr>
+      </w:pPr>
+      <w:r>
+        <w:rPr>
+          <w:rFonts w:ascii="Didot" w:hAnsi="Didot" w:cs="Didot" w:hint="cs"/>
+          <w:sz w:val="22"/>
+          <w:szCs w:val="22"/>
+        </w:rPr>
+        <w:t>A cada passo o robô deve:</w:t>
+      </w:r>
+    </w:p>
+    <w:p>
+      <w:pPr>
+        <w:pStyle w:val="NormalWeb"/>
+        <w:spacing w:before="0" w:beforeAutospacing="0" w:after="0" w:afterAutospacing="0" w:line="360" w:lineRule="auto"/>
+        <w:rPr>
+          <w:rFonts w:ascii="Didot" w:hAnsi="Didot" w:cs="Didot"/>
+          <w:sz w:val="22"/>
+          <w:szCs w:val="22"/>
+        </w:rPr>
+      </w:pPr>
+      <w:r>
+        <w:rPr>
+          <w:rFonts w:ascii="Didot" w:hAnsi="Didot" w:cs="Didot"/>
+          <w:sz w:val="22"/>
+          <w:szCs w:val="22"/>
+        </w:rPr>
+        <w:t xml:space="preserve">- </w:t>
+      </w:r>
+      <w:r>
+        <w:rPr>
+          <w:rFonts w:ascii="Didot" w:hAnsi="Didot" w:cs="Didot" w:hint="cs"/>
+          <w:sz w:val="22"/>
+          <w:szCs w:val="22"/>
+        </w:rPr>
+        <w:t>Andar o tamanho do lad</w:t>
+      </w:r>
+      <w:r>
+        <w:rPr>
+          <w:rFonts w:ascii="Didot" w:hAnsi="Didot" w:cs="Didot"/>
+          <w:sz w:val="22"/>
+          <w:szCs w:val="22"/>
+        </w:rPr>
+        <w:t>o</w:t>
+      </w:r>
+    </w:p>
+    <w:p>
+      <w:pPr>
+        <w:pStyle w:val="NormalWeb"/>
+        <w:spacing w:before="0" w:beforeAutospacing="0" w:after="0" w:afterAutospacing="0" w:line="360" w:lineRule="auto"/>
+        <w:rPr>
+          <w:rFonts w:ascii="Didot" w:hAnsi="Didot" w:cs="Didot" w:hint="cs"/>
+          <w:sz w:val="22"/>
+          <w:szCs w:val="22"/>
+        </w:rPr>
+      </w:pPr>
+      <w:r>
+        <w:rPr>
+          <w:rFonts w:ascii="Didot" w:hAnsi="Didot" w:cs="Didot"/>
+          <w:sz w:val="22"/>
+          <w:szCs w:val="22"/>
+        </w:rPr>
+        <w:t xml:space="preserve">- </w:t>
+      </w:r>
+      <w:r>
+        <w:rPr>
+          <w:rFonts w:ascii="Didot" w:hAnsi="Didot" w:cs="Didot" w:hint="cs"/>
+          <w:sz w:val="22"/>
+          <w:szCs w:val="22"/>
+        </w:rPr>
+        <w:t xml:space="preserve">Girar </w:t>
+      </w:r>
+      <m:oMath>
+        <m:r>
+          <m:rPr>
+            <m:sty m:val="p"/>
+          </m:rPr>
+          <w:rPr>
+            <w:rFonts w:ascii="Cambria Math" w:hAnsi="Cambria Math" w:cs="Didot"/>
+            <w:sz w:val="22"/>
+            <w:szCs w:val="22"/>
+          </w:rPr>
+          <m:t>θ</m:t>
+        </m:r>
+      </m:oMath>
+      <w:r>
+        <w:rPr>
+          <w:rFonts w:ascii="Didot" w:hAnsi="Didot" w:cs="Didot" w:hint="cs"/>
+          <w:sz w:val="22"/>
+          <w:szCs w:val="22"/>
+        </w:rPr>
+        <w:t xml:space="preserve"> graus</w:t>
+      </w:r>
+    </w:p>
+    <w:p>
+      <w:pPr>
+        <w:pStyle w:val="NormalWeb"/>
+        <w:spacing w:before="0" w:beforeAutospacing="0" w:after="0" w:afterAutospacing="0" w:line="360" w:lineRule="auto"/>
+        <w:rPr>
+          <w:rFonts w:ascii="Didot" w:hAnsi="Didot" w:cs="Didot"/>
+          <w:sz w:val="22"/>
+          <w:szCs w:val="22"/>
+        </w:rPr>
+      </w:pPr>
+      <w:r>
+        <w:rPr>
+          <w:rFonts w:ascii="Didot" w:hAnsi="Didot" w:cs="Didot" w:hint="cs"/>
+          <w:sz w:val="22"/>
+          <w:szCs w:val="22"/>
+        </w:rPr>
+        <w:t>(Repetir isso n vezes)</w:t>
+      </w:r>
+    </w:p>
+    <w:p>
+      <w:pPr>
+        <w:pStyle w:val="NormalWeb"/>
+        <w:spacing w:before="0" w:beforeAutospacing="0" w:after="0" w:afterAutospacing="0" w:line="360" w:lineRule="auto"/>
+        <w:rPr>
+          <w:rFonts w:ascii="Didot" w:hAnsi="Didot" w:cs="Didot" w:hint="cs"/>
+          <w:sz w:val="22"/>
+          <w:szCs w:val="22"/>
+        </w:rPr>
+      </w:pPr>
+    </w:p>
+    <w:p>
+      <w:pPr>
+        <w:pStyle w:val="NormalWeb"/>
+        <w:spacing w:before="0" w:beforeAutospacing="0" w:after="0" w:afterAutospacing="0" w:line="360" w:lineRule="auto"/>
+        <w:rPr>
+          <w:rFonts w:ascii="Didot" w:hAnsi="Didot" w:cs="Didot" w:hint="cs"/>
+          <w:b/>
+          <w:bCs/>
+          <w:sz w:val="22"/>
+          <w:szCs w:val="22"/>
+        </w:rPr>
+      </w:pPr>
+      <w:r>
+        <w:rPr>
+          <w:rFonts w:ascii="Didot" w:hAnsi="Didot" w:cs="Didot" w:hint="cs"/>
+          <w:b/>
+          <w:bCs/>
+          <w:sz w:val="22"/>
+          <w:szCs w:val="22"/>
+        </w:rPr>
+        <w:t>Requisitos:</w:t>
+      </w:r>
+    </w:p>
+    <w:p>
+      <w:pPr>
+        <w:pStyle w:val="NormalWeb"/>
+        <w:spacing w:before="0" w:beforeAutospacing="0" w:after="0" w:afterAutospacing="0" w:line="360" w:lineRule="auto"/>
+        <w:rPr>
+          <w:rFonts w:ascii="Didot" w:hAnsi="Didot" w:cs="Didot"/>
+          <w:sz w:val="22"/>
+          <w:szCs w:val="22"/>
+        </w:rPr>
+      </w:pPr>
+      <w:r>
+        <w:rPr>
+          <w:rFonts w:ascii="Didot" w:hAnsi="Didot" w:cs="Didot"/>
+          <w:sz w:val="22"/>
+          <w:szCs w:val="22"/>
+        </w:rPr>
+        <w:t xml:space="preserve">- </w:t>
+      </w:r>
+      <w:r>
+        <w:rPr>
+          <w:rFonts w:ascii="Didot" w:hAnsi="Didot" w:cs="Didot" w:hint="cs"/>
+          <w:sz w:val="22"/>
+          <w:szCs w:val="22"/>
+        </w:rPr>
+        <w:t>Pedir os valores de n e tamanho</w:t>
+      </w:r>
+      <w:r>
+        <w:rPr>
+          <w:rFonts w:ascii="Didot" w:hAnsi="Didot" w:cs="Didot" w:hint="cs"/>
+          <w:sz w:val="22"/>
+          <w:szCs w:val="22"/>
+        </w:rPr>
+        <w:br/>
+      </w:r>
+      <w:r>
+        <w:rPr>
+          <w:rFonts w:ascii="Didot" w:hAnsi="Didot" w:cs="Didot"/>
+          <w:sz w:val="22"/>
+          <w:szCs w:val="22"/>
+        </w:rPr>
+        <w:t xml:space="preserve">- </w:t>
+      </w:r>
+      <w:r>
+        <w:rPr>
+          <w:rFonts w:ascii="Didot" w:hAnsi="Didot" w:cs="Didot" w:hint="cs"/>
+          <w:sz w:val="22"/>
+          <w:szCs w:val="22"/>
+        </w:rPr>
+        <w:t>Validar se n ≥ 3</w:t>
+      </w:r>
+      <w:r>
+        <w:rPr>
+          <w:rFonts w:ascii="Didot" w:hAnsi="Didot" w:cs="Didot" w:hint="cs"/>
+          <w:sz w:val="22"/>
+          <w:szCs w:val="22"/>
+        </w:rPr>
+        <w:br/>
+      </w:r>
+      <w:r>
+        <w:rPr>
+          <w:rFonts w:ascii="Didot" w:hAnsi="Didot" w:cs="Didot"/>
+          <w:sz w:val="22"/>
+          <w:szCs w:val="22"/>
+        </w:rPr>
+        <w:t xml:space="preserve">- </w:t>
+      </w:r>
+      <w:r>
+        <w:rPr>
+          <w:rFonts w:ascii="Didot" w:hAnsi="Didot" w:cs="Didot" w:hint="cs"/>
+          <w:sz w:val="22"/>
+          <w:szCs w:val="22"/>
+        </w:rPr>
+        <w:t>Usar a caneta para desenhar</w:t>
+      </w:r>
+      <w:r>
+        <w:rPr>
+          <w:rFonts w:ascii="Didot" w:hAnsi="Didot" w:cs="Didot" w:hint="cs"/>
+          <w:sz w:val="22"/>
+          <w:szCs w:val="22"/>
+        </w:rPr>
+        <w:br/>
+      </w:r>
+      <w:r>
+        <w:rPr>
+          <w:rFonts w:ascii="Didot" w:hAnsi="Didot" w:cs="Didot"/>
+          <w:sz w:val="22"/>
+          <w:szCs w:val="22"/>
+        </w:rPr>
+        <w:t xml:space="preserve">- </w:t>
+      </w:r>
+      <w:r>
+        <w:rPr>
+          <w:rFonts w:ascii="Didot" w:hAnsi="Didot" w:cs="Didot" w:hint="cs"/>
+          <w:sz w:val="22"/>
+          <w:szCs w:val="22"/>
+        </w:rPr>
+        <w:t>Utilizar um laço de repetição</w:t>
+      </w:r>
+      <w:r>
+        <w:rPr>
+          <w:rFonts w:ascii="Didot" w:hAnsi="Didot" w:cs="Didot" w:hint="cs"/>
+          <w:sz w:val="22"/>
+          <w:szCs w:val="22"/>
+        </w:rPr>
+        <w:br/>
+      </w:r>
+      <w:r>
+        <w:rPr>
+          <w:rFonts w:ascii="Didot" w:hAnsi="Didot" w:cs="Didot"/>
+          <w:sz w:val="22"/>
+          <w:szCs w:val="22"/>
+        </w:rPr>
+        <w:t xml:space="preserve">- </w:t>
+      </w:r>
+      <w:r>
+        <w:rPr>
+          <w:rFonts w:ascii="Didot" w:hAnsi="Didot" w:cs="Didot" w:hint="cs"/>
+          <w:sz w:val="22"/>
+          <w:szCs w:val="22"/>
+        </w:rPr>
+        <w:t>Fechar a figura corretamente</w:t>
+      </w:r>
+    </w:p>
+    <w:p>
+      <w:pPr>
+        <w:pStyle w:val="NormalWeb"/>
+        <w:spacing w:before="0" w:beforeAutospacing="0" w:after="0" w:afterAutospacing="0" w:line="360" w:lineRule="auto"/>
+        <w:rPr>
+          <w:rFonts w:ascii="Didot" w:hAnsi="Didot" w:cs="Didot"/>
+          <w:sz w:val="22"/>
+          <w:szCs w:val="22"/>
+        </w:rPr>
+      </w:pPr>
+    </w:p>
+    <w:p>
+      <w:pPr>
+        <w:pStyle w:val="NormalWeb"/>
+        <w:spacing w:before="0" w:beforeAutospacing="0" w:after="0" w:afterAutospacing="0" w:line="360" w:lineRule="auto"/>
+        <w:rPr>
+          <w:rFonts w:ascii="Didot" w:hAnsi="Didot" w:cs="Didot"/>
+          <w:sz w:val="22"/>
+          <w:szCs w:val="22"/>
+        </w:rPr>
+      </w:pPr>
+    </w:p>
+    <w:p>
+      <w:pPr>
+        <w:pStyle w:val="NormalWeb"/>
+        <w:spacing w:before="0" w:beforeAutospacing="0" w:after="0" w:afterAutospacing="0" w:line="360" w:lineRule="auto"/>
+        <w:rPr>
+          <w:rFonts w:ascii="Didot" w:hAnsi="Didot" w:cs="Didot"/>
+          <w:sz w:val="22"/>
+          <w:szCs w:val="22"/>
+        </w:rPr>
+      </w:pPr>
+    </w:p>
+    <w:p>
+      <w:pPr>
+        <w:pStyle w:val="NormalWeb"/>
+        <w:spacing w:before="0" w:beforeAutospacing="0" w:after="0" w:afterAutospacing="0" w:line="360" w:lineRule="auto"/>
+        <w:rPr>
+          <w:rFonts w:ascii="Didot" w:hAnsi="Didot" w:cs="Didot"/>
+          <w:sz w:val="22"/>
+          <w:szCs w:val="22"/>
+        </w:rPr>
+      </w:pPr>
+    </w:p>
+    <w:p>
+      <w:pPr>
+        <w:pStyle w:val="NormalWeb"/>
+        <w:spacing w:before="0" w:beforeAutospacing="0" w:after="0" w:afterAutospacing="0" w:line="360" w:lineRule="auto"/>
+        <w:rPr>
+          <w:rFonts w:ascii="Didot" w:hAnsi="Didot" w:cs="Didot" w:hint="cs"/>
+          <w:sz w:val="22"/>
+          <w:szCs w:val="22"/>
+        </w:rPr>
+      </w:pPr>
+    </w:p>
+    <w:p>
+      <w:pPr>
+        <w:pStyle w:val="NormalWeb"/>
+        <w:spacing w:before="0" w:beforeAutospacing="0" w:after="0" w:afterAutospacing="0" w:line="360" w:lineRule="auto"/>
+        <w:rPr>
+          <w:rFonts w:ascii="Didot" w:hAnsi="Didot" w:cs="Didot" w:hint="cs"/>
+          <w:b/>
+          <w:bCs/>
+          <w:sz w:val="22"/>
+          <w:szCs w:val="22"/>
+        </w:rPr>
+      </w:pPr>
+      <w:r>
+        <w:rPr>
+          <w:rFonts w:ascii="Didot" w:hAnsi="Didot" w:cs="Didot" w:hint="cs"/>
+          <w:b/>
+          <w:bCs/>
+          <w:sz w:val="22"/>
+          <w:szCs w:val="22"/>
+        </w:rPr>
+        <w:lastRenderedPageBreak/>
+        <w:t>Entregas:</w:t>
+      </w:r>
+    </w:p>
+    <w:p>
+      <w:pPr>
+        <w:pStyle w:val="NormalWeb"/>
+        <w:spacing w:before="0" w:beforeAutospacing="0" w:after="0" w:afterAutospacing="0" w:line="360" w:lineRule="auto"/>
+        <w:rPr>
+          <w:rFonts w:ascii="Didot" w:hAnsi="Didot" w:cs="Didot"/>
+          <w:sz w:val="22"/>
+          <w:szCs w:val="22"/>
+        </w:rPr>
+      </w:pPr>
+      <w:r>
+        <w:rPr>
+          <w:rFonts w:ascii="Didot" w:hAnsi="Didot" w:cs="Didot"/>
+          <w:sz w:val="22"/>
+          <w:szCs w:val="22"/>
+        </w:rPr>
+        <w:t xml:space="preserve">- </w:t>
+      </w:r>
+      <w:r>
+        <w:rPr>
+          <w:rFonts w:ascii="Didot" w:hAnsi="Didot" w:cs="Didot" w:hint="cs"/>
+          <w:sz w:val="22"/>
+          <w:szCs w:val="22"/>
+        </w:rPr>
+        <w:t>Código no Scratch (print ou link)</w:t>
+      </w:r>
+      <w:r>
+        <w:rPr>
+          <w:rFonts w:ascii="Didot" w:hAnsi="Didot" w:cs="Didot" w:hint="cs"/>
+          <w:sz w:val="22"/>
+          <w:szCs w:val="22"/>
+        </w:rPr>
+        <w:br/>
+      </w:r>
+      <w:r>
+        <w:rPr>
+          <w:rFonts w:ascii="Didot" w:hAnsi="Didot" w:cs="Didot"/>
+          <w:sz w:val="22"/>
+          <w:szCs w:val="22"/>
+        </w:rPr>
+        <w:t xml:space="preserve">- </w:t>
+      </w:r>
+      <w:r>
+        <w:rPr>
+          <w:rFonts w:ascii="Didot" w:hAnsi="Didot" w:cs="Didot" w:hint="cs"/>
+          <w:sz w:val="22"/>
+          <w:szCs w:val="22"/>
+        </w:rPr>
+        <w:t>Explicação do algoritmo</w:t>
+      </w:r>
+      <w:r>
+        <w:rPr>
+          <w:rFonts w:ascii="Didot" w:hAnsi="Didot" w:cs="Didot" w:hint="cs"/>
+          <w:sz w:val="22"/>
+          <w:szCs w:val="22"/>
+        </w:rPr>
+        <w:br/>
+      </w:r>
+      <w:r>
+        <w:rPr>
+          <w:rFonts w:ascii="Didot" w:hAnsi="Didot" w:cs="Didot"/>
+          <w:sz w:val="22"/>
+          <w:szCs w:val="22"/>
+        </w:rPr>
+        <w:t xml:space="preserve">- </w:t>
+      </w:r>
+      <w:r>
+        <w:rPr>
+          <w:rFonts w:ascii="Didot" w:hAnsi="Didot" w:cs="Didot" w:hint="cs"/>
+          <w:sz w:val="22"/>
+          <w:szCs w:val="22"/>
+        </w:rPr>
+        <w:t>Testes com pelo menos:</w:t>
+      </w:r>
+      <w:r>
+        <w:rPr>
+          <w:rFonts w:ascii="Didot" w:hAnsi="Didot" w:cs="Didot" w:hint="cs"/>
+          <w:sz w:val="22"/>
+          <w:szCs w:val="22"/>
+        </w:rPr>
+        <w:br/>
+      </w:r>
+      <w:r>
+        <w:rPr>
+          <w:rFonts w:ascii="Didot" w:hAnsi="Didot" w:cs="Didot"/>
+          <w:sz w:val="22"/>
+          <w:szCs w:val="22"/>
+        </w:rPr>
+        <w:tab/>
+      </w:r>
+      <w:r>
+        <w:rPr>
+          <w:rFonts w:ascii="Didot" w:hAnsi="Didot" w:cs="Didot" w:hint="cs"/>
+          <w:sz w:val="22"/>
+          <w:szCs w:val="22"/>
+        </w:rPr>
+        <w:t>n = 3 (triângulo)</w:t>
+      </w:r>
+      <w:r>
+        <w:rPr>
+          <w:rFonts w:ascii="Didot" w:hAnsi="Didot" w:cs="Didot" w:hint="cs"/>
+          <w:sz w:val="22"/>
+          <w:szCs w:val="22"/>
+        </w:rPr>
+        <w:br/>
+      </w:r>
+      <w:r>
+        <w:rPr>
+          <w:rFonts w:ascii="Didot" w:hAnsi="Didot" w:cs="Didot"/>
+          <w:sz w:val="22"/>
+          <w:szCs w:val="22"/>
+        </w:rPr>
+        <w:tab/>
+      </w:r>
+      <w:r>
+        <w:rPr>
+          <w:rFonts w:ascii="Didot" w:hAnsi="Didot" w:cs="Didot" w:hint="cs"/>
+          <w:sz w:val="22"/>
+          <w:szCs w:val="22"/>
+        </w:rPr>
+        <w:t>n = 4 (quadrado)</w:t>
+      </w:r>
+      <w:r>
+        <w:rPr>
+          <w:rFonts w:ascii="Didot" w:hAnsi="Didot" w:cs="Didot" w:hint="cs"/>
+          <w:sz w:val="22"/>
+          <w:szCs w:val="22"/>
+        </w:rPr>
+        <w:br/>
+      </w:r>
+      <w:r>
+        <w:rPr>
+          <w:rFonts w:ascii="Didot" w:hAnsi="Didot" w:cs="Didot"/>
+          <w:sz w:val="22"/>
+          <w:szCs w:val="22"/>
+        </w:rPr>
+        <w:tab/>
+      </w:r>
+      <w:r>
+        <w:rPr>
+          <w:rFonts w:ascii="Didot" w:hAnsi="Didot" w:cs="Didot" w:hint="cs"/>
+          <w:sz w:val="22"/>
+          <w:szCs w:val="22"/>
+        </w:rPr>
+        <w:t>n = 6 (hexágono)</w:t>
+      </w:r>
+    </w:p>
+    <w:p>
+      <w:pPr>
+        <w:pStyle w:val="NormalWeb"/>
+        <w:spacing w:before="0" w:beforeAutospacing="0" w:after="0" w:afterAutospacing="0" w:line="360" w:lineRule="auto"/>
+        <w:rPr>
+          <w:rFonts w:ascii="Didot" w:hAnsi="Didot" w:cs="Didot" w:hint="cs"/>
+          <w:sz w:val="22"/>
+          <w:szCs w:val="22"/>
+        </w:rPr>
+      </w:pPr>
+      <w:r>
+        <w:rPr>
+          <w:rFonts w:ascii="Didot" w:hAnsi="Didot" w:cs="Didot"/>
+          <w:sz w:val="22"/>
+          <w:szCs w:val="22"/>
+        </w:rPr>
+        <w:t xml:space="preserve">- </w:t>
+      </w:r>
+      <w:r>
+        <w:rPr>
+          <w:rFonts w:ascii="Didot" w:hAnsi="Didot" w:cs="Didot" w:hint="cs"/>
+          <w:sz w:val="22"/>
+          <w:szCs w:val="22"/>
+        </w:rPr>
+        <w:t>Análise:</w:t>
+      </w:r>
+      <w:r>
+        <w:rPr>
+          <w:rFonts w:ascii="Didot" w:hAnsi="Didot" w:cs="Didot" w:hint="cs"/>
+          <w:sz w:val="22"/>
+          <w:szCs w:val="22"/>
+        </w:rPr>
+        <w:br/>
+      </w:r>
+      <w:r>
+        <w:rPr>
+          <w:rFonts w:ascii="Didot" w:hAnsi="Didot" w:cs="Didot"/>
+          <w:sz w:val="22"/>
+          <w:szCs w:val="22"/>
+        </w:rPr>
+        <w:tab/>
+        <w:t xml:space="preserve">- </w:t>
+      </w:r>
+      <w:r>
+        <w:rPr>
+          <w:rFonts w:ascii="Didot" w:hAnsi="Didot" w:cs="Didot" w:hint="cs"/>
+          <w:sz w:val="22"/>
+          <w:szCs w:val="22"/>
+        </w:rPr>
+        <w:t>O que acontece quando n aumenta?</w:t>
+      </w:r>
+      <w:r>
+        <w:rPr>
+          <w:rFonts w:ascii="Didot" w:hAnsi="Didot" w:cs="Didot" w:hint="cs"/>
+          <w:sz w:val="22"/>
+          <w:szCs w:val="22"/>
+        </w:rPr>
+        <w:br/>
+      </w:r>
+      <w:r>
+        <w:rPr>
+          <w:rFonts w:ascii="Didot" w:hAnsi="Didot" w:cs="Didot"/>
+          <w:sz w:val="22"/>
+          <w:szCs w:val="22"/>
+        </w:rPr>
+        <w:tab/>
+        <w:t xml:space="preserve">- </w:t>
+      </w:r>
+      <w:r>
+        <w:rPr>
+          <w:rFonts w:ascii="Didot" w:hAnsi="Didot" w:cs="Didot" w:hint="cs"/>
+          <w:sz w:val="22"/>
+          <w:szCs w:val="22"/>
+        </w:rPr>
+        <w:t>O que muda no desenho?</w:t>
+      </w:r>
+    </w:p>
+    <w:p>
+      <w:pPr>
+        <w:pStyle w:val="NormalWeb"/>
+        <w:spacing w:before="0" w:beforeAutospacing="0" w:after="0" w:afterAutospacing="0" w:line="360" w:lineRule="auto"/>
+        <w:rPr>
+          <w:rFonts w:ascii="Apple Color Emoji" w:hAnsi="Apple Color Emoji" w:cs="Apple Color Emoji"/>
+          <w:sz w:val="22"/>
+          <w:szCs w:val="22"/>
+        </w:rPr>
+      </w:pPr>
+    </w:p>
+    <w:p>
+      <w:pPr>
+        <w:pStyle w:val="NormalWeb"/>
+        <w:spacing w:before="0" w:beforeAutospacing="0" w:after="0" w:afterAutospacing="0" w:line="360" w:lineRule="auto"/>
+        <w:rPr>
+          <w:rFonts w:ascii="Didot" w:hAnsi="Didot" w:cs="Didot" w:hint="cs"/>
+        </w:rPr>
+      </w:pPr>
+      <w:r>
+        <w:rPr>
+          <w:rFonts w:ascii="Didot" w:hAnsi="Didot" w:cs="Didot" w:hint="cs"/>
+          <w:sz w:val="22"/>
+          <w:szCs w:val="22"/>
+        </w:rPr>
+        <w:t>Dica: Quanto maior o n, mais a figura</w:t>
+      </w:r>
+      <w:r>
+        <w:rPr>
+          <w:rFonts w:ascii="Didot" w:hAnsi="Didot" w:cs="Didot" w:hint="cs"/>
+        </w:rPr>
+        <w:t xml:space="preserve"> se aproxima de um círculo.</w:t>
+      </w:r>
+    </w:p>
+    <w:p>
+      <w:pPr>
+        <w:spacing w:after="0" w:line="360" w:lineRule="auto"/>
+        <w:rPr>
+          <w:rFonts w:ascii="Didot" w:hAnsi="Didot" w:cs="Didot"/>
+        </w:rPr>
+      </w:pPr>
+    </w:p>
+    <w:p>
+      <w:pPr>
+        <w:spacing w:after="0" w:line="360" w:lineRule="auto"/>
         <w:rPr>
           <w:rFonts w:ascii="Didot" w:hAnsi="Didot" w:cs="Didot" w:hint="cs"/>
         </w:rPr>
@@ -1116,6 +1962,32 @@
       </w:tblBorders>
     </w:tblPr>
   </w:style>
+  <w:style w:type="paragraph" w:styleId="NormalWeb">
+    <w:name w:val="Normal (Web)"/>
+    <w:basedOn w:val="Normal"/>
+    <w:uiPriority w:val="99"/>
+    <w:semiHidden/>
+    <w:unhideWhenUsed/>
+    <w:rsid w:val="009D0329"/>
+    <w:pPr>
+      <w:spacing w:before="100" w:beforeAutospacing="1" w:after="100" w:afterAutospacing="1" w:line="240" w:lineRule="auto"/>
+    </w:pPr>
+    <w:rPr>
+      <w:rFonts w:ascii="Times New Roman" w:eastAsia="Times New Roman" w:hAnsi="Times New Roman" w:cs="Times New Roman"/>
+      <w:kern w:val="0"/>
+      <w14:ligatures w14:val="none"/>
+    </w:rPr>
+  </w:style>
+  <w:style w:type="character" w:styleId="PlaceholderText">
+    <w:name w:val="Placeholder Text"/>
+    <w:basedOn w:val="DefaultParagraphFont"/>
+    <w:uiPriority w:val="99"/>
+    <w:semiHidden/>
+    <w:rsid w:val="009D0329"/>
+    <w:rPr>
+      <w:color w:val="666666"/>
+    </w:rPr>
+  </w:style>
 </w:styles>
 </file>
 

</xml_diff>